<commit_message>
Unify native builds in the root Xcode project
Use shared app and MailKit targets for local, Developer ID, sandboxed development and Store configurations. Build the CLI and uninstaller as separate native targets, package existing products without recursive compilation, and regenerate developer documentation in native builds. Preserve direct-install identities and storage; verify Store exclusions and local packaging.
</commit_message>
<xml_diff>
--- a/docs/app-store-deployment-plan.docx
+++ b/docs/app-store-deployment-plan.docx
@@ -57,7 +57,7 @@
         <w:spacing w:after="120"/>
       </w:pPr>
       <w:r>
-        <w:t xml:space="preserve">Implementation update: build 14 now includes a Store Xcode project, manual address setup, email-file diagnostics, complete setup archives and bounded private file history. An unsigned archive compiles and passes payload inspection. Apple enrollment is processing. Section 9 records the completed work and the tests that must wait for signing. The working installation has not been replaced.</w:t>
+        <w:t xml:space="preserve">Implementation update: build 15 uses one root Xcode project for local and Store builds. Store preparation includes manual address setup, email-file diagnostics, complete setup archives and bounded private file history. An unsigned archive compiles and passes payload inspection. Apple enrollment is processing. Section 9 records the completed work and the tests that must wait for signing. The working installation has not been replaced.</w:t>
       </w:r>
     </w:p>
     <w:p>
@@ -145,6 +145,7 @@
           </w:tcPr>
           <w:p>
             <w:pPr>
+              <w:keepNext/>
               <w:spacing w:after="0"/>
             </w:pPr>
             <w:r>
@@ -163,6 +164,7 @@
           </w:tcPr>
           <w:p>
             <w:pPr>
+              <w:keepNext/>
               <w:spacing w:after="0"/>
             </w:pPr>
             <w:r>
@@ -181,6 +183,7 @@
           </w:tcPr>
           <w:p>
             <w:pPr>
+              <w:keepNext/>
               <w:spacing w:after="0"/>
             </w:pPr>
             <w:r>
@@ -627,6 +630,7 @@
           </w:tcPr>
           <w:p>
             <w:pPr>
+              <w:keepNext/>
               <w:spacing w:after="0"/>
             </w:pPr>
             <w:r>
@@ -645,6 +649,7 @@
           </w:tcPr>
           <w:p>
             <w:pPr>
+              <w:keepNext/>
               <w:spacing w:after="0"/>
             </w:pPr>
             <w:r>
@@ -663,6 +668,7 @@
           </w:tcPr>
           <w:p>
             <w:pPr>
+              <w:keepNext/>
               <w:spacing w:after="0"/>
             </w:pPr>
             <w:r>
@@ -1356,6 +1362,7 @@
           </w:tcPr>
           <w:p>
             <w:pPr>
+              <w:keepNext/>
               <w:spacing w:after="0"/>
             </w:pPr>
             <w:r>
@@ -1374,6 +1381,7 @@
           </w:tcPr>
           <w:p>
             <w:pPr>
+              <w:keepNext/>
               <w:spacing w:after="0"/>
             </w:pPr>
             <w:r>
@@ -1392,6 +1400,7 @@
           </w:tcPr>
           <w:p>
             <w:pPr>
+              <w:keepNext/>
               <w:spacing w:after="0"/>
             </w:pPr>
             <w:r>
@@ -2365,6 +2374,7 @@
           </w:tcPr>
           <w:p>
             <w:pPr>
+              <w:keepNext/>
               <w:spacing w:after="0"/>
             </w:pPr>
             <w:r>
@@ -2383,6 +2393,7 @@
           </w:tcPr>
           <w:p>
             <w:pPr>
+              <w:keepNext/>
               <w:spacing w:after="0"/>
             </w:pPr>
             <w:r>
@@ -2401,6 +2412,7 @@
           </w:tcPr>
           <w:p>
             <w:pPr>
+              <w:keepNext/>
               <w:spacing w:after="0"/>
             </w:pPr>
             <w:r>
@@ -3042,10 +3054,32 @@
           <w:sz w:val="19"/>
           <w:shd w:val="clear" w:color="auto" w:fill="F2F2F2"/>
         </w:rPr>
-        <w:t xml:space="preserve">MacApp/Store/Mail-Filter.xcodeproj</w:t>
-      </w:r>
-      <w:r>
-        <w:t xml:space="preserve"> builds the shared Swift sources as a sandboxed host and embedded extension. Development and Store configurations use separate bundle IDs and groups. </w:t>
+        <w:t xml:space="preserve">Mail-Filter.xcodeproj</w:t>
+      </w:r>
+      <w:r>
+        <w:t xml:space="preserve"> at the repository root builds the same host and embedded extension targets for every distribution channel. Its Development and Store configurations are sandboxed and use separate bundle IDs and groups; Local and DeveloperID retain direct-distribution behavior. The Store scheme excludes the separate engineering CLI, uninstaller and packaging targets. </w:t>
+      </w:r>
+      <w:r>
+        <w:rPr>
+          <w:rFonts w:ascii="Courier New" w:hAnsi="Courier New" w:cs="Courier New"/>
+          <w:sz w:val="19"/>
+          <w:shd w:val="clear" w:color="auto" w:fill="F2F2F2"/>
+        </w:rPr>
+        <w:t xml:space="preserve">MacApp/Build/</w:t>
+      </w:r>
+      <w:r>
+        <w:t xml:space="preserve"> holds the shared configuration and signing templates, and </w:t>
+      </w:r>
+      <w:r>
+        <w:rPr>
+          <w:rFonts w:ascii="Courier New" w:hAnsi="Courier New" w:cs="Courier New"/>
+          <w:sz w:val="19"/>
+          <w:shd w:val="clear" w:color="auto" w:fill="F2F2F2"/>
+        </w:rPr>
+        <w:t xml:space="preserve">MacApp/generate-project.py</w:t>
+      </w:r>
+      <w:r>
+        <w:t xml:space="preserve"> owns native source membership. </w:t>
       </w:r>
       <w:r>
         <w:rPr>

</xml_diff>

<commit_message>
Synchronize Xcode documentation and preserve project settings
</commit_message>
<xml_diff>
--- a/docs/app-store-deployment-plan.docx
+++ b/docs/app-store-deployment-plan.docx
@@ -104,7 +104,7 @@
         <w:spacing w:after="120"/>
       </w:pPr>
       <w:r>
-        <w:t xml:space="preserve">The current native settings application is not sandboxed. Its embedded extension is sandboxed and uses a narrow local-development filesystem exception. The existing release script supports Developer ID distribution with an App Group, but still leaves the host application unsandboxed. Neither configuration is a complete App Store configuration.</w:t>
+        <w:t xml:space="preserve">At the build-13 assessment baseline, the native settings application was unsandboxed and its embedded extension used a narrow local-development filesystem exception. The direct Local and DeveloperID configurations retain that intended host behavior. The current root Xcode project additionally provides sandboxed Development and Store configurations with shared-group entitlements; signed runtime qualification remains outstanding.</w:t>
       </w:r>
     </w:p>
     <w:tbl>
@@ -1926,37 +1926,59 @@
         <w:spacing w:after="120"/>
       </w:pPr>
       <w:r>
-        <w:t xml:space="preserve">Owner: engineering. Add an Xcode project or equivalent reproducible Xcode archive setup for the host and embedded extension. Preserve the current shell entry points and document the mapping to the new targets. Add sandboxed development and Store Release configurations, explicit feature capabilities, privacy resources, version metadata and archive validation. Leave standalone CLI compilation intact.</w:t>
-      </w:r>
-    </w:p>
-    <w:p>
-      <w:pPr>
-        <w:spacing w:after="120"/>
-      </w:pPr>
-      <w:r>
-        <w:t xml:space="preserve">Primary files are the new project/configuration files, </w:t>
-      </w:r>
-      <w:r>
-        <w:rPr>
-          <w:rFonts w:ascii="Courier New" w:hAnsi="Courier New" w:cs="Courier New"/>
-          <w:sz w:val="19"/>
-          <w:shd w:val="clear" w:color="auto" w:fill="F2F2F2"/>
-        </w:rPr>
-        <w:t xml:space="preserve">MacApp/build.sh</w:t>
-      </w:r>
-      <w:r>
-        <w:t xml:space="preserve">, </w:t>
-      </w:r>
-      <w:r>
-        <w:rPr>
-          <w:rFonts w:ascii="Courier New" w:hAnsi="Courier New" w:cs="Courier New"/>
-          <w:sz w:val="19"/>
-          <w:shd w:val="clear" w:color="auto" w:fill="F2F2F2"/>
-        </w:rPr>
-        <w:t xml:space="preserve">MacApp/package.sh</w:t>
-      </w:r>
-      <w:r>
-        <w:t xml:space="preserve"> and the bundle-verification scripts. Keep direct packaging separate from Store archiving. Verify that the Store payload contains only the intended application and extension, then upload a validation build before investing in final listing materials.</w:t>
+        <w:t xml:space="preserve">Implemented in build 15. The root </w:t>
+      </w:r>
+      <w:r>
+        <w:rPr>
+          <w:rFonts w:ascii="Courier New" w:hAnsi="Courier New" w:cs="Courier New"/>
+          <w:sz w:val="19"/>
+          <w:shd w:val="clear" w:color="auto" w:fill="F2F2F2"/>
+        </w:rPr>
+        <w:t xml:space="preserve">Mail-Filter.xcodeproj</w:t>
+      </w:r>
+      <w:r>
+        <w:t xml:space="preserve"> owns the shared app and extension targets, plus separate engineering CLI and uninstaller targets. Its Local, DeveloperID, BuildCheck, Development and Store configurations select the channel's identity, storage, entitlements and signing. </w:t>
+      </w:r>
+      <w:r>
+        <w:rPr>
+          <w:rFonts w:ascii="Courier New" w:hAnsi="Courier New" w:cs="Courier New"/>
+          <w:sz w:val="19"/>
+          <w:shd w:val="clear" w:color="auto" w:fill="F2F2F2"/>
+        </w:rPr>
+        <w:t xml:space="preserve">MacApp/generate-project.py</w:t>
+      </w:r>
+      <w:r>
+        <w:t xml:space="preserve"> is the native source-list authority; shell build entry points invoke the same project. The developer guide documents all five schemes and their Build/Run/Archive behavior.</w:t>
+      </w:r>
+    </w:p>
+    <w:p>
+      <w:pPr>
+        <w:spacing w:after="120"/>
+      </w:pPr>
+      <w:r>
+        <w:t xml:space="preserve">The Local Installer scheme packages native dependencies without recursively compiling them. Store schemes and payload checks exclude engineering tools, the uninstaller, PATH components and Desktop shortcuts. A shared target regenerates the Word documentation for native builds. Configuration files live in </w:t>
+      </w:r>
+      <w:r>
+        <w:rPr>
+          <w:rFonts w:ascii="Courier New" w:hAnsi="Courier New" w:cs="Courier New"/>
+          <w:sz w:val="19"/>
+          <w:shd w:val="clear" w:color="auto" w:fill="F2F2F2"/>
+        </w:rPr>
+        <w:t xml:space="preserve">MacApp/Build/</w:t>
+      </w:r>
+      <w:r>
+        <w:t xml:space="preserve">; private team settings belong in the ignored </w:t>
+      </w:r>
+      <w:r>
+        <w:rPr>
+          <w:rFonts w:ascii="Courier New" w:hAnsi="Courier New" w:cs="Courier New"/>
+          <w:sz w:val="19"/>
+          <w:shd w:val="clear" w:color="auto" w:fill="F2F2F2"/>
+        </w:rPr>
+        <w:t xml:space="preserve">Signing.local.xcconfig</w:t>
+      </w:r>
+      <w:r>
+        <w:t xml:space="preserve">. The remaining gate is a provisioned archive that passes runtime qualification and App Store Connect validation before final listing preparation.</w:t>
       </w:r>
     </w:p>
     <w:p>

</xml_diff>

<commit_message>
Finalize App Store packaging and local build configuration
</commit_message>
<xml_diff>
--- a/docs/app-store-deployment-plan.docx
+++ b/docs/app-store-deployment-plan.docx
@@ -57,7 +57,7 @@
         <w:spacing w:after="120"/>
       </w:pPr>
       <w:r>
-        <w:t xml:space="preserve">Implementation update: build 15 uses one root Xcode project for local and Store builds. Store preparation includes manual address setup, email-file diagnostics, complete setup archives and bounded private file history. An unsigned archive compiles and passes payload inspection. Apple enrollment is processing. Section 9 records the completed work and the tests that must wait for signing. The working installation has not been replaced.</w:t>
+        <w:t xml:space="preserve">Qualification update, October 19, 2026: developer-team access is active. Build 15 passed signed Development startup, account discovery, settings persistence, read-only analysis, shared activity, incoming Preview and actual Junk moves. A restored message stayed in Inbox after Mail restarted, and the user confirmed a Junk move with the settings app closed. The production archive and local distribution export passed their signature, provisioning and payload checks. Build 18 subsequently processed in App Store Connect, and the publisher reported completing submission for App Review. Section 10 separates these observations from the remaining clean-install tests and review outcome. The original installed app is preserved; the separately identified development extension is the active test installation.</w:t>
       </w:r>
     </w:p>
     <w:p>
@@ -104,7 +104,7 @@
         <w:spacing w:after="120"/>
       </w:pPr>
       <w:r>
-        <w:t xml:space="preserve">At the build-13 assessment baseline, the native settings application was unsandboxed and its embedded extension used a narrow local-development filesystem exception. The direct Local and DeveloperID configurations retain that intended host behavior. The current root Xcode project additionally provides sandboxed Development and Store configurations with shared-group entitlements; signed runtime qualification remains outstanding.</w:t>
+        <w:t xml:space="preserve">At the build-13 assessment baseline, the native settings application was unsandboxed and its embedded extension used a narrow local-development filesystem exception. The direct Local and DeveloperID configurations retain that intended host behavior. The root Xcode project additionally provides sandboxed Development and Store configurations with shared-group entitlements. The following tables describe the October 17 probes; Section 10 records the subsequent signed Development qualification.</w:t>
       </w:r>
     </w:p>
     <w:tbl>
@@ -563,7 +563,7 @@
               <w:spacing w:after="0"/>
             </w:pPr>
             <w:r>
-              <w:t xml:space="preserve">Not established</w:t>
+              <w:t xml:space="preserve">Not established by the October 17 probes</w:t>
             </w:r>
           </w:p>
         </w:tc>
@@ -577,7 +577,7 @@
               <w:spacing w:after="0"/>
             </w:pPr>
             <w:r>
-              <w:t xml:space="preserve">This Mac has zero valid Apple signing identities. A real team-authorized group has not been tested.</w:t>
+              <w:t xml:space="preserve">These ad-hoc experiments did not use team-authorized profiles. Later signed sharing results are in Section 10.</w:t>
             </w:r>
           </w:p>
         </w:tc>
@@ -894,7 +894,7 @@
         <w:spacing w:after="120"/>
       </w:pPr>
       <w:r>
-        <w:t xml:space="preserve">Earlier attempts inside the restricted execution environment could not launch the sandbox helper or complete synthetic generation, and did not see Mail. The successful desktop run establishes that those outcomes are not reproducible in the normal session. It does not identify their precise cause. Provisioned host/extension sharing, selected-message source access, permission denial and Store archive behavior remain separate qualification tasks.</w:t>
+        <w:t xml:space="preserve">Earlier attempts inside the restricted execution environment could not launch the sandbox helper or complete synthetic generation, and did not see Mail. The successful desktop run establishes that those outcomes are not reproducible in the normal session. It does not identify their precise cause. These probes alone did not establish provisioned sharing, selected-message source access, permission denial or Store archive behavior; subsequent qualification is recorded separately.</w:t>
       </w:r>
     </w:p>
     <w:p>
@@ -1903,7 +1903,7 @@
         <w:spacing w:after="120"/>
       </w:pPr>
       <w:r>
-        <w:t xml:space="preserve">Owner: account holder with engineering support. Decide individual or organization enrollment, obtain membership, and authorize the team. Register development and production host/extension identifiers and separate App Groups. Establish certificate custody and roles. The exit condition is a signed development archive whose declared capabilities match its profiles, without modifying the working installation.</w:t>
+        <w:t xml:space="preserve">Owner: account holder with engineering support. Paid-team access, the Apple Development identity and Development app/extension profiles are now established. Xcode registered the test Mac and authorized the Development App Group. Production identifiers, the separate production group and distribution assets must also qualify through archive/export. Keep team overrides in the ignored local configuration and establish certificate custody and App Store Connect roles.</w:t>
       </w:r>
     </w:p>
     <w:p>
@@ -1978,7 +1978,15 @@
         <w:t xml:space="preserve">Signing.local.xcconfig</w:t>
       </w:r>
       <w:r>
-        <w:t xml:space="preserve">. The remaining gate is a provisioned archive that passes runtime qualification and App Store Connect validation before final listing preparation.</w:t>
+        <w:t xml:space="preserve">. Automatic archiving uses development signing; App Store export applies distribution signing. Archive verification is a separate stage and must never substitute for strict verification of the exported distribution artifact. See </w:t>
+      </w:r>
+      <w:hyperlink r:id="rId12">
+        <w:r>
+          <w:t xml:space="preserve">Apple's distribution signing workflow</w:t>
+        </w:r>
+      </w:hyperlink>
+      <w:r>
+        <w:t xml:space="preserve">.</w:t>
       </w:r>
     </w:p>
     <w:p>
@@ -2025,7 +2033,7 @@
       <w:r>
         <w:t xml:space="preserve"> to resolve the authorized group consistently in the host and extension. A missing group must stop processing rather than fall back to another build's data. Keep production identities and data locations stable after launch. Refer to </w:t>
       </w:r>
-      <w:hyperlink r:id="rId12">
+      <w:hyperlink r:id="rId13">
         <w:r>
           <w:t xml:space="preserve">App Group access guidance</w:t>
         </w:r>
@@ -2041,7 +2049,7 @@
       <w:r>
         <w:t xml:space="preserve">Create an explicit export/import flow for settings and protection. A selected settings file does not automatically grant access to an adjacent protection file: request the containing export folder, both individual files, or use a single versioned migration archive. Add the required user-selected-file capabilities and use security-scoped access where needed. </w:t>
       </w:r>
-      <w:hyperlink r:id="rId13">
+      <w:hyperlink r:id="rId14">
         <w:r>
           <w:t xml:space="preserve">User-selected file access</w:t>
         </w:r>
@@ -2215,7 +2223,7 @@
       <w:r>
         <w:t xml:space="preserve"> calls need an approved reason matching their timer use; add no reasons for APIs the shipped product does not use. </w:t>
       </w:r>
-      <w:hyperlink r:id="rId14">
+      <w:hyperlink r:id="rId15">
         <w:r>
           <w:t xml:space="preserve">Required-reason API guidance</w:t>
         </w:r>
@@ -2228,7 +2236,7 @@
       <w:r>
         <w:t xml:space="preserve">Prepare accurate App Store privacy answers after auditing the final binary and any support or analytics services. Local inference alone is not off-device collection under Apple's definition. Evaluate optional reports and any future services separately. Review the Foundation Models acceptable-use requirements and keep the product a user-directed classification tool. </w:t>
       </w:r>
-      <w:hyperlink r:id="rId15">
+      <w:hyperlink r:id="rId16">
         <w:r>
           <w:t xml:space="preserve">App privacy details</w:t>
         </w:r>
@@ -2236,7 +2244,7 @@
       <w:r>
         <w:t xml:space="preserve">, </w:t>
       </w:r>
-      <w:hyperlink r:id="rId16">
+      <w:hyperlink r:id="rId17">
         <w:r>
           <w:t xml:space="preserve">Foundation Models acceptable use</w:t>
         </w:r>
@@ -2303,7 +2311,7 @@
       <w:r>
         <w:t xml:space="preserve">Owner: publisher and engineering. Distribute the release candidate through TestFlight, collect reproducible reports, fix launch/setup failures and confirm the migration path with another tester. A TestFlight build uses Store capabilities; it should not contain a special unsandboxed escape path. </w:t>
       </w:r>
-      <w:hyperlink r:id="rId17">
+      <w:hyperlink r:id="rId18">
         <w:r>
           <w:t xml:space="preserve">TestFlight overview</w:t>
         </w:r>
@@ -2316,7 +2324,7 @@
       <w:r>
         <w:t xml:space="preserve">Complete App Store Connect metadata and compliance answers. Include synthetic sample emails, instructions to enable Mail-Filter in Mail, Apple Intelligence requirements and a repeatable demonstration of classification and extension behavior. Supply a reviewer contact and explain any requested automation entitlement. Reviewers should not depend on naturally arriving political email to evaluate the product. </w:t>
       </w:r>
-      <w:hyperlink r:id="rId18">
+      <w:hyperlink r:id="rId19">
         <w:r>
           <w:t xml:space="preserve">App Review preparation</w:t>
         </w:r>
@@ -2329,7 +2337,7 @@
       <w:r>
         <w:t xml:space="preserve">Upload using Xcode or Transporter, choose the processed build, add it for review and submit. Use manual release for the first version so approval and publication are separate decisions. Resolve review feedback before release. Keep the accepted archive, symbols, entitlement report and release notes. </w:t>
       </w:r>
-      <w:hyperlink r:id="rId19">
+      <w:hyperlink r:id="rId20">
         <w:r>
           <w:t xml:space="preserve">Upload builds</w:t>
         </w:r>
@@ -2337,7 +2345,7 @@
       <w:r>
         <w:t xml:space="preserve">, </w:t>
       </w:r>
-      <w:hyperlink r:id="rId20">
+      <w:hyperlink r:id="rId21">
         <w:r>
           <w:t xml:space="preserve">Submit an app</w:t>
         </w:r>
@@ -2474,7 +2482,7 @@
               <w:spacing w:after="0"/>
             </w:pPr>
             <w:r>
-              <w:t xml:space="preserve">Pending account holder</w:t>
+              <w:t xml:space="preserve">Paid team, Development profiles and distribution export passed</w:t>
             </w:r>
           </w:p>
         </w:tc>
@@ -2488,7 +2496,7 @@
               <w:spacing w:after="0"/>
             </w:pPr>
             <w:r>
-              <w:t xml:space="preserve">Active membership, valid identities and authorized profiles</w:t>
+              <w:t xml:space="preserve">Maintain signing assets and publisher access</w:t>
             </w:r>
           </w:p>
         </w:tc>
@@ -2521,7 +2529,7 @@
               <w:spacing w:after="0"/>
             </w:pPr>
             <w:r>
-              <w:t xml:space="preserve">Ad-hoc probes passed</w:t>
+              <w:t xml:space="preserve">Signed Development passed</w:t>
             </w:r>
           </w:p>
         </w:tc>
@@ -2535,7 +2543,7 @@
               <w:spacing w:after="0"/>
             </w:pPr>
             <w:r>
-              <w:t xml:space="preserve">Host and extension launch from the provisioned archive</w:t>
+              <w:t xml:space="preserve">Confirm startup from the final Store installation</w:t>
             </w:r>
           </w:p>
         </w:tc>
@@ -2568,7 +2576,7 @@
               <w:spacing w:after="0"/>
             </w:pPr>
             <w:r>
-              <w:t xml:space="preserve">Open</w:t>
+              <w:t xml:space="preserve">Signed Development passed</w:t>
             </w:r>
           </w:p>
         </w:tc>
@@ -2582,7 +2590,7 @@
               <w:spacing w:after="0"/>
             </w:pPr>
             <w:r>
-              <w:t xml:space="preserve">Both processes read/write the intended group without development exceptions</w:t>
+              <w:t xml:space="preserve">Confirm the separate production group on a clean installation</w:t>
             </w:r>
           </w:p>
         </w:tc>
@@ -2615,7 +2623,7 @@
               <w:spacing w:after="0"/>
             </w:pPr>
             <w:r>
-              <w:t xml:space="preserve">Account-count probe passed</w:t>
+              <w:t xml:space="preserve">Signed inventory and selected analysis passed</w:t>
             </w:r>
           </w:p>
         </w:tc>
@@ -2629,7 +2637,7 @@
               <w:spacing w:after="0"/>
             </w:pPr>
             <w:r>
-              <w:t xml:space="preserve">Full inventory and selected-source access qualify with acceptable entitlements, or the manual path is complete</w:t>
+              <w:t xml:space="preserve">Qualify denial and manual paths; obtain entitlement acceptance</w:t>
             </w:r>
           </w:p>
         </w:tc>
@@ -2662,7 +2670,7 @@
               <w:spacing w:after="0"/>
             </w:pPr>
             <w:r>
-              <w:t xml:space="preserve">Open</w:t>
+              <w:t xml:space="preserve">Fixture checks passed</w:t>
             </w:r>
           </w:p>
         </w:tc>
@@ -2676,7 +2684,7 @@
               <w:spacing w:after="0"/>
             </w:pPr>
             <w:r>
-              <w:t xml:space="preserve">Open/Save access works without broad filesystem exceptions</w:t>
+              <w:t xml:space="preserve">Signed Open/Save panels and exports work without broad exceptions</w:t>
             </w:r>
           </w:p>
         </w:tc>
@@ -2709,7 +2717,7 @@
               <w:spacing w:after="0"/>
             </w:pPr>
             <w:r>
-              <w:t xml:space="preserve">Sandboxed synthetic appeal passed</w:t>
+              <w:t xml:space="preserve">Signed incoming classification passed</w:t>
             </w:r>
           </w:p>
         </w:tc>
@@ -2723,7 +2731,7 @@
               <w:spacing w:after="0"/>
             </w:pPr>
             <w:r>
-              <w:t xml:space="preserve">Controls and representative consented fixtures work inside the distributed extension</w:t>
+              <w:t xml:space="preserve">Complete the provider, language and model-availability matrix</w:t>
             </w:r>
           </w:p>
         </w:tc>
@@ -2756,7 +2764,7 @@
               <w:spacing w:after="0"/>
             </w:pPr>
             <w:r>
-              <w:t xml:space="preserve">Complete archive fixture checks passed</w:t>
+              <w:t xml:space="preserve">Fixtures and signed restoration passed</w:t>
             </w:r>
           </w:p>
         </w:tc>
@@ -2770,7 +2778,7 @@
               <w:spacing w:after="0"/>
             </w:pPr>
             <w:r>
-              <w:t xml:space="preserve">Signed import and restored-message protection survive update and restart</w:t>
+              <w:t xml:space="preserve">Complete signed setup import, confirmation and update migration</w:t>
             </w:r>
           </w:p>
         </w:tc>
@@ -2803,7 +2811,7 @@
               <w:spacing w:after="0"/>
             </w:pPr>
             <w:r>
-              <w:t xml:space="preserve">Container and fixture checks passed</w:t>
+              <w:t xml:space="preserve">Shared activity passed in Development</w:t>
             </w:r>
           </w:p>
         </w:tc>
@@ -2817,7 +2825,7 @@
               <w:spacing w:after="0"/>
             </w:pPr>
             <w:r>
-              <w:t xml:space="preserve">Useful bounded reports after host quit, extension restart and log-service failure</w:t>
+              <w:t xml:space="preserve">Qualify signed support-file export, rotation and failure behavior</w:t>
             </w:r>
           </w:p>
         </w:tc>
@@ -2850,7 +2858,7 @@
               <w:spacing w:after="0"/>
             </w:pPr>
             <w:r>
-              <w:t xml:space="preserve">Pending isolated live test</w:t>
+              <w:t xml:space="preserve">Junk, restoration and host-quit tests passed</w:t>
             </w:r>
           </w:p>
         </w:tc>
@@ -2864,7 +2872,7 @@
               <w:spacing w:after="0"/>
             </w:pPr>
             <w:r>
-              <w:t xml:space="preserve">Controlled eligible test mail moves; restored false positive stays in Inbox</w:t>
+              <w:t xml:space="preserve">Repeat relevant checks from the final Store installation</w:t>
             </w:r>
           </w:p>
         </w:tc>
@@ -2897,7 +2905,7 @@
               <w:spacing w:after="0"/>
             </w:pPr>
             <w:r>
-              <w:t xml:space="preserve">Unsigned archive and payload checks passed</w:t>
+              <w:t xml:space="preserve">Signed archive, local export and build 18 upload processing passed</w:t>
             </w:r>
           </w:p>
         </w:tc>
@@ -2911,7 +2919,7 @@
               <w:spacing w:after="0"/>
             </w:pPr>
             <w:r>
-              <w:t xml:space="preserve">Provisioned archive validates for App Store Connect</w:t>
+              <w:t xml:space="preserve">Preserve the submitted archive and exported package</w:t>
             </w:r>
           </w:p>
         </w:tc>
@@ -2944,7 +2952,7 @@
               <w:spacing w:after="0"/>
             </w:pPr>
             <w:r>
-              <w:t xml:space="preserve">Open</w:t>
+              <w:t xml:space="preserve">Publisher reported submission of version 2.1.0 build 18</w:t>
             </w:r>
           </w:p>
         </w:tc>
@@ -2958,7 +2966,7 @@
               <w:spacing w:after="0"/>
             </w:pPr>
             <w:r>
-              <w:t xml:space="preserve">Submitted build and requested entitlements accepted</w:t>
+              <w:t xml:space="preserve">Apple accepts the submitted build and requested entitlements</w:t>
             </w:r>
           </w:p>
         </w:tc>
@@ -2997,7 +3005,7 @@
         <w:t xml:space="preserve">1.  </w:t>
       </w:r>
       <w:r>
-        <w:t xml:space="preserve">Complete Apple enrollment, then confirm identifiers, group registration and the signing team. The desktop probes and unsigned implementation checks are complete; provisioning and upload qualification depend on the account.</w:t>
+        <w:t xml:space="preserve">Monitor the submitted version in App Store Connect and respond to Apple's questions or requested changes. Submission is not App Review acceptance; the selected release setting is automatic release after approval.</w:t>
       </w:r>
     </w:p>
     <w:p>
@@ -3009,7 +3017,7 @@
         <w:t xml:space="preserve">2.  </w:t>
       </w:r>
       <w:r>
-        <w:t xml:space="preserve">Build the isolated signed development configuration. Qualify App Group sharing, full inventory, selected-message source, permission denial, file panels and import confirmation before enabling any apply-mode test.</w:t>
+        <w:t xml:space="preserve">Preserve the submitted build-18 package and archive. A development-signed archive alone is not a distributable Store artifact; the exported package has separately passed distribution checks.</w:t>
       </w:r>
     </w:p>
     <w:p>
@@ -3021,7 +3029,7 @@
         <w:t xml:space="preserve">3.  </w:t>
       </w:r>
       <w:r>
-        <w:t xml:space="preserve">Complete the isolated Mail action/update matrix, publish support and privacy URLs, and settle the review metadata. Keep the existing working installation and developer CLI available during this work.</w:t>
+        <w:t xml:space="preserve">Complete signed file-panel, email-file, setup import/confirmation, denial, clean-install and update tests. Repeat the necessary runtime checks with production storage and a TestFlight or Store installation.</w:t>
       </w:r>
     </w:p>
     <w:p>
@@ -3033,7 +3041,7 @@
         <w:t xml:space="preserve">4.  </w:t>
       </w:r>
       <w:r>
-        <w:t xml:space="preserve">Validate the production archive, beta through TestFlight, and prepare the review submission after the technical gates pass.</w:t>
+        <w:t xml:space="preserve">Complete the remaining provider/model matrix and keep the published support/privacy pages consistent with the app. Preserve the working developer CLI and original installation until migration is qualified.</w:t>
       </w:r>
     </w:p>
     <w:p>
@@ -3048,7 +3056,7 @@
           <w:sz w:val="32"/>
           <w:color w:val="000000"/>
         </w:rPr>
-        <w:t xml:space="preserve">9 Work completed while enrollment processes</w:t>
+        <w:t xml:space="preserve">9 Implementation completed before signed qualification</w:t>
       </w:r>
     </w:p>
     <w:p>
@@ -3233,7 +3241,7 @@
       <w:r>
         <w:t xml:space="preserve">; final binary and questionnaire review remains necessary. See </w:t>
       </w:r>
-      <w:hyperlink r:id="rId14">
+      <w:hyperlink r:id="rId15">
         <w:r>
           <w:t xml:space="preserve">Apple required-reason API guidance</w:t>
         </w:r>
@@ -3262,7 +3270,7 @@
         <w:spacing w:after="120"/>
       </w:pPr>
       <w:r>
-        <w:t xml:space="preserve">The native regression suite passes, including 42 dedicated checks for manual setup, complete migration, protection retention, import confirmation, email-file extraction, export privacy, log rotation, expiry and log-storage failure. All use synthetic input and temporary stores. The actual Store host and extension compile and archive with signing disabled, and payload inspection passes. These results do not establish signed runtime access, UI behavior under Powerbox, live Mail actions or model accuracy in the distributed extension.</w:t>
+        <w:t xml:space="preserve">The native regression suite passes, including 42 dedicated checks for manual setup, complete migration, protection retention, import confirmation, email-file extraction, export privacy, log rotation, expiry and log-storage failure. All use synthetic input and temporary stores. The unsigned Store archive also passes payload inspection. These automated checks establish fixture contracts; signed runtime observations are recorded in Section 10 and do not replace clean-install or App Review qualification.</w:t>
       </w:r>
     </w:p>
     <w:p>
@@ -3289,7 +3297,677 @@
         <w:t xml:space="preserve">docs/store-review-preparation.md</w:t>
       </w:r>
       <w:r>
-        <w:t xml:space="preserve"> provides listing, privacy-policy and entitlement drafts plus a reproducible reviewer demonstration. Public support/privacy URLs, contact details, screenshots and final business/compliance answers remain publisher work. Signed clean-install/update tests, TestFlight and App Review remain open.</w:t>
+        <w:t xml:space="preserve"> provides listing and entitlement notes plus a reproducible reviewer demonstration. The public pages and submission preparation were completed later on October 19, as recorded below. Signed clean-install/update tests, TestFlight installation and the App Review outcome remain open.</w:t>
+      </w:r>
+    </w:p>
+    <w:p>
+      <w:pPr>
+        <w:pStyle w:val="Heading1"/>
+        <w:keepNext/>
+        <w:spacing w:before="240" w:after="80"/>
+      </w:pPr>
+      <w:r>
+        <w:rPr>
+          <w:b/>
+          <w:sz w:val="32"/>
+          <w:color w:val="000000"/>
+        </w:rPr>
+        <w:t xml:space="preserve">10 Signed Development qualification on October 19, 2026</w:t>
+      </w:r>
+    </w:p>
+    <w:p>
+      <w:pPr>
+        <w:spacing w:after="120"/>
+      </w:pPr>
+      <w:r>
+        <w:t xml:space="preserve">The tested app and extension use the Development identities and provisioned App Group, version 2.1.0, build 15. Signatures and embedded profiles were checked for both bundles. The test Mac was registered with the team through Xcode. Personal team identifiers, account addresses, message contents and private reports are excluded from this public plan.</w:t>
+      </w:r>
+    </w:p>
+    <w:tbl>
+      <w:tblPr>
+        <w:tblW w:w="9360" w:type="dxa"/>
+        <w:tblLayout w:type="fixed"/>
+        <w:tblCellMar>
+          <w:top w:w="90" w:type="dxa"/>
+          <w:bottom w:w="90" w:type="dxa"/>
+          <w:left w:w="120" w:type="dxa"/>
+          <w:right w:w="120" w:type="dxa"/>
+        </w:tblCellMar>
+        <w:tblBorders>
+          <w:top w:val="single" w:sz="4" w:space="0" w:color="D9D9D9"/>
+          <w:left w:val="single" w:sz="4" w:space="0" w:color="D9D9D9"/>
+          <w:bottom w:val="single" w:sz="4" w:space="0" w:color="D9D9D9"/>
+          <w:right w:val="single" w:sz="4" w:space="0" w:color="D9D9D9"/>
+          <w:insideH w:val="single" w:sz="4" w:space="0" w:color="D9D9D9"/>
+          <w:insideV w:val="single" w:sz="4" w:space="0" w:color="D9D9D9"/>
+        </w:tblBorders>
+        <w:tblLook w:val="04A0" w:firstRow="1" w:lastRow="0" w:firstColumn="0" w:lastColumn="0" w:noHBand="0" w:noVBand="1"/>
+      </w:tblPr>
+      <w:tblGrid>
+        <w:gridCol w:w="3557"/>
+        <w:gridCol w:w="5803"/>
+      </w:tblGrid>
+      <w:tr>
+        <w:trPr>
+          <w:cantSplit/>
+          <w:tblHeader/>
+        </w:trPr>
+        <w:tc>
+          <w:tcPr>
+            <w:tcW w:w="3557" w:type="dxa"/>
+            <w:vAlign w:val="center"/>
+            <w:shd w:val="clear" w:color="auto" w:fill="D9E2F3"/>
+          </w:tcPr>
+          <w:p>
+            <w:pPr>
+              <w:keepNext/>
+              <w:spacing w:after="0"/>
+            </w:pPr>
+            <w:r>
+              <w:rPr>
+                <w:b/>
+              </w:rPr>
+              <w:t xml:space="preserve">Check</w:t>
+            </w:r>
+          </w:p>
+        </w:tc>
+        <w:tc>
+          <w:tcPr>
+            <w:tcW w:w="5803" w:type="dxa"/>
+            <w:vAlign w:val="center"/>
+            <w:shd w:val="clear" w:color="auto" w:fill="D9E2F3"/>
+          </w:tcPr>
+          <w:p>
+            <w:pPr>
+              <w:keepNext/>
+              <w:spacing w:after="0"/>
+            </w:pPr>
+            <w:r>
+              <w:rPr>
+                <w:b/>
+              </w:rPr>
+              <w:t xml:space="preserve">Result and evidence</w:t>
+            </w:r>
+          </w:p>
+        </w:tc>
+      </w:tr>
+      <w:tr>
+        <w:trPr>
+          <w:cantSplit/>
+        </w:trPr>
+        <w:tc>
+          <w:tcPr>
+            <w:tcW w:w="3557" w:type="dxa"/>
+            <w:vAlign w:val="center"/>
+          </w:tcPr>
+          <w:p>
+            <w:pPr>
+              <w:spacing w:after="0"/>
+            </w:pPr>
+            <w:r>
+              <w:t xml:space="preserve">Signed startup</w:t>
+            </w:r>
+          </w:p>
+        </w:tc>
+        <w:tc>
+          <w:tcPr>
+            <w:tcW w:w="5803" w:type="dxa"/>
+            <w:vAlign w:val="center"/>
+          </w:tcPr>
+          <w:p>
+            <w:pPr>
+              <w:spacing w:after="0"/>
+            </w:pPr>
+            <w:r>
+              <w:t xml:space="preserve">User confirmed a normal settings window without storage or permission errors.</w:t>
+            </w:r>
+          </w:p>
+        </w:tc>
+      </w:tr>
+      <w:tr>
+        <w:trPr>
+          <w:cantSplit/>
+        </w:trPr>
+        <w:tc>
+          <w:tcPr>
+            <w:tcW w:w="3557" w:type="dxa"/>
+            <w:vAlign w:val="center"/>
+          </w:tcPr>
+          <w:p>
+            <w:pPr>
+              <w:spacing w:after="0"/>
+            </w:pPr>
+            <w:r>
+              <w:t xml:space="preserve">Mail account discovery</w:t>
+            </w:r>
+          </w:p>
+        </w:tc>
+        <w:tc>
+          <w:tcPr>
+            <w:tcW w:w="5803" w:type="dxa"/>
+            <w:vAlign w:val="center"/>
+          </w:tcPr>
+          <w:p>
+            <w:pPr>
+              <w:spacing w:after="0"/>
+            </w:pPr>
+            <w:r>
+              <w:t xml:space="preserve">User confirmed the configured Mail accounts appeared.</w:t>
+            </w:r>
+          </w:p>
+        </w:tc>
+      </w:tr>
+      <w:tr>
+        <w:trPr>
+          <w:cantSplit/>
+        </w:trPr>
+        <w:tc>
+          <w:tcPr>
+            <w:tcW w:w="3557" w:type="dxa"/>
+            <w:vAlign w:val="center"/>
+          </w:tcPr>
+          <w:p>
+            <w:pPr>
+              <w:spacing w:after="0"/>
+            </w:pPr>
+            <w:r>
+              <w:t xml:space="preserve">Settings persistence</w:t>
+            </w:r>
+          </w:p>
+        </w:tc>
+        <w:tc>
+          <w:tcPr>
+            <w:tcW w:w="5803" w:type="dxa"/>
+            <w:vAlign w:val="center"/>
+          </w:tcPr>
+          <w:p>
+            <w:pPr>
+              <w:spacing w:after="0"/>
+            </w:pPr>
+            <w:r>
+              <w:t xml:space="preserve">Selected accounts and Preview were retained after closing and reopening the app.</w:t>
+            </w:r>
+          </w:p>
+        </w:tc>
+      </w:tr>
+      <w:tr>
+        <w:trPr>
+          <w:cantSplit/>
+        </w:trPr>
+        <w:tc>
+          <w:tcPr>
+            <w:tcW w:w="3557" w:type="dxa"/>
+            <w:vAlign w:val="center"/>
+          </w:tcPr>
+          <w:p>
+            <w:pPr>
+              <w:spacing w:after="0"/>
+            </w:pPr>
+            <w:r>
+              <w:t xml:space="preserve">Selected-message analysis</w:t>
+            </w:r>
+          </w:p>
+        </w:tc>
+        <w:tc>
+          <w:tcPr>
+            <w:tcW w:w="5803" w:type="dxa"/>
+            <w:vAlign w:val="center"/>
+          </w:tcPr>
+          <w:p>
+            <w:pPr>
+              <w:spacing w:after="0"/>
+            </w:pPr>
+            <w:r>
+              <w:t xml:space="preserve">User confirmed read-only analysis completed.</w:t>
+            </w:r>
+          </w:p>
+        </w:tc>
+      </w:tr>
+      <w:tr>
+        <w:trPr>
+          <w:cantSplit/>
+        </w:trPr>
+        <w:tc>
+          <w:tcPr>
+            <w:tcW w:w="3557" w:type="dxa"/>
+            <w:vAlign w:val="center"/>
+          </w:tcPr>
+          <w:p>
+            <w:pPr>
+              <w:spacing w:after="0"/>
+            </w:pPr>
+            <w:r>
+              <w:t xml:space="preserve">Callback and shared activity</w:t>
+            </w:r>
+          </w:p>
+        </w:tc>
+        <w:tc>
+          <w:tcPr>
+            <w:tcW w:w="5803" w:type="dxa"/>
+            <w:vAlign w:val="center"/>
+          </w:tcPr>
+          <w:p>
+            <w:pPr>
+              <w:spacing w:after="0"/>
+            </w:pPr>
+            <w:r>
+              <w:t xml:space="preserve">Logs recorded body-request/body-ready callbacks; the Development UI count increased from four to six.</w:t>
+            </w:r>
+          </w:p>
+        </w:tc>
+      </w:tr>
+      <w:tr>
+        <w:trPr>
+          <w:cantSplit/>
+        </w:trPr>
+        <w:tc>
+          <w:tcPr>
+            <w:tcW w:w="3557" w:type="dxa"/>
+            <w:vAlign w:val="center"/>
+          </w:tcPr>
+          <w:p>
+            <w:pPr>
+              <w:spacing w:after="0"/>
+            </w:pPr>
+            <w:r>
+              <w:t xml:space="preserve">Own-sender protection</w:t>
+            </w:r>
+          </w:p>
+        </w:tc>
+        <w:tc>
+          <w:tcPr>
+            <w:tcW w:w="5803" w:type="dxa"/>
+            <w:vAlign w:val="center"/>
+          </w:tcPr>
+          <w:p>
+            <w:pPr>
+              <w:spacing w:after="0"/>
+            </w:pPr>
+            <w:r>
+              <w:t xml:space="preserve">The 9:18 a.m. self-email was skipped as self-mail and retained in Inbox.</w:t>
+            </w:r>
+          </w:p>
+        </w:tc>
+      </w:tr>
+      <w:tr>
+        <w:trPr>
+          <w:cantSplit/>
+        </w:trPr>
+        <w:tc>
+          <w:tcPr>
+            <w:tcW w:w="3557" w:type="dxa"/>
+            <w:vAlign w:val="center"/>
+          </w:tcPr>
+          <w:p>
+            <w:pPr>
+              <w:spacing w:after="0"/>
+            </w:pPr>
+            <w:r>
+              <w:t xml:space="preserve">Incoming political Preview</w:t>
+            </w:r>
+          </w:p>
+        </w:tc>
+        <w:tc>
+          <w:tcPr>
+            <w:tcW w:w="5803" w:type="dxa"/>
+            <w:vAlign w:val="center"/>
+          </w:tcPr>
+          <w:p>
+            <w:pPr>
+              <w:spacing w:after="0"/>
+            </w:pPr>
+            <w:r>
+              <w:t xml:space="preserve">At 9:20 a.m., logs recorded a political label and Preview outcome, with no Junk request.</w:t>
+            </w:r>
+          </w:p>
+        </w:tc>
+      </w:tr>
+      <w:tr>
+        <w:trPr>
+          <w:cantSplit/>
+        </w:trPr>
+        <w:tc>
+          <w:tcPr>
+            <w:tcW w:w="3557" w:type="dxa"/>
+            <w:vAlign w:val="center"/>
+          </w:tcPr>
+          <w:p>
+            <w:pPr>
+              <w:spacing w:after="0"/>
+            </w:pPr>
+            <w:r>
+              <w:t xml:space="preserve">Actual Junk action</w:t>
+            </w:r>
+          </w:p>
+        </w:tc>
+        <w:tc>
+          <w:tcPr>
+            <w:tcW w:w="5803" w:type="dxa"/>
+            <w:vAlign w:val="center"/>
+          </w:tcPr>
+          <w:p>
+            <w:pPr>
+              <w:spacing w:after="0"/>
+            </w:pPr>
+            <w:r>
+              <w:t xml:space="preserve">User confirmed an incoming political email moved into Junk.</w:t>
+            </w:r>
+          </w:p>
+        </w:tc>
+      </w:tr>
+      <w:tr>
+        <w:trPr>
+          <w:cantSplit/>
+        </w:trPr>
+        <w:tc>
+          <w:tcPr>
+            <w:tcW w:w="3557" w:type="dxa"/>
+            <w:vAlign w:val="center"/>
+          </w:tcPr>
+          <w:p>
+            <w:pPr>
+              <w:spacing w:after="0"/>
+            </w:pPr>
+            <w:r>
+              <w:t xml:space="preserve">Restoration after restart</w:t>
+            </w:r>
+          </w:p>
+        </w:tc>
+        <w:tc>
+          <w:tcPr>
+            <w:tcW w:w="5803" w:type="dxa"/>
+            <w:vAlign w:val="center"/>
+          </w:tcPr>
+          <w:p>
+            <w:pPr>
+              <w:spacing w:after="0"/>
+            </w:pPr>
+            <w:r>
+              <w:t xml:space="preserve">User restored the message to Inbox, restarted Mail and confirmed it stayed there.</w:t>
+            </w:r>
+          </w:p>
+        </w:tc>
+      </w:tr>
+      <w:tr>
+        <w:trPr>
+          <w:cantSplit/>
+        </w:trPr>
+        <w:tc>
+          <w:tcPr>
+            <w:tcW w:w="3557" w:type="dxa"/>
+            <w:vAlign w:val="center"/>
+          </w:tcPr>
+          <w:p>
+            <w:pPr>
+              <w:spacing w:after="0"/>
+            </w:pPr>
+            <w:r>
+              <w:t xml:space="preserve">Settings app closed</w:t>
+            </w:r>
+          </w:p>
+        </w:tc>
+        <w:tc>
+          <w:tcPr>
+            <w:tcW w:w="5803" w:type="dxa"/>
+            <w:vAlign w:val="center"/>
+          </w:tcPr>
+          <w:p>
+            <w:pPr>
+              <w:spacing w:after="0"/>
+            </w:pPr>
+            <w:r>
+              <w:t xml:space="preserve">User confirmed a political email arriving at 11:20 a.m. moved into Junk while the settings app was closed.</w:t>
+            </w:r>
+          </w:p>
+        </w:tc>
+      </w:tr>
+    </w:tbl>
+    <w:p/>
+    <w:p>
+      <w:pPr>
+        <w:spacing w:after="120"/>
+      </w:pPr>
+      <w:r>
+        <w:t xml:space="preserve">Times above are local to the test Mac, America/Los_Angeles. Logs establish callback and classification stages; the user observations establish the actual mailbox moves, settings UI behavior and restored-message result. These observations cover this test installation, not every provider or all classifier inputs. A production Store installation has separate storage and still requires its own qualification.</w:t>
+      </w:r>
+    </w:p>
+    <w:p>
+      <w:pPr>
+        <w:pStyle w:val="Heading2"/>
+        <w:keepNext/>
+        <w:spacing w:before="240" w:after="80"/>
+      </w:pPr>
+      <w:r>
+        <w:rPr>
+          <w:b/>
+          <w:sz w:val="26"/>
+          <w:color w:val="000000"/>
+        </w:rPr>
+        <w:t xml:space="preserve">10.1 Development registration and lifecycle findings</w:t>
+      </w:r>
+    </w:p>
+    <w:p>
+      <w:pPr>
+        <w:spacing w:after="120"/>
+      </w:pPr>
+      <w:r>
+        <w:t xml:space="preserve">The development bundle was present in the full PlugInKit registry but absent from normal Mail extension discovery when only the build-folder copies were registered. A separately named copy under </w:t>
+      </w:r>
+      <w:r>
+        <w:rPr>
+          <w:rFonts w:ascii="Courier New" w:hAnsi="Courier New" w:cs="Courier New"/>
+          <w:sz w:val="19"/>
+          <w:shd w:val="clear" w:color="auto" w:fill="F2F2F2"/>
+        </w:rPr>
+        <w:t xml:space="preserve">~/Applications/Mail-Filter Development.app</w:t>
+      </w:r>
+      <w:r>
+        <w:t xml:space="preserve">, followed by explicit registration of its embedded extension, appeared in normal discovery and Mail's own extension list. Use the signed build workflow for the exact staging steps.</w:t>
+      </w:r>
+    </w:p>
+    <w:p>
+      <w:pPr>
+        <w:spacing w:after="120"/>
+      </w:pPr>
+      <w:r>
+        <w:t xml:space="preserve">Opening or replacing a development app can refresh its registration. During this run, Mail retained the old registration while a new registration was created for the same extension. Mail then rejected incoming requests with PlugInKit error 16, "other version in use." A clean Mail quit released the old extension process; reopening Mail restored callbacks. Quit Mail before replacing or re-registering a test extension, launch the intended settings copy, then reopen Mail. Avoid interleaving Xcode Run copies with the staged installation during a live test.</w:t>
+      </w:r>
+    </w:p>
+    <w:p>
+      <w:pPr>
+        <w:spacing w:after="120"/>
+      </w:pPr>
+      <w:r>
+        <w:t xml:space="preserve">The original and development apps have separate activity stores. Verify the app identity when comparing counts. Incoming callbacks count invocations, not unique emails; body retrieval normally produces two callbacks. Preview positives appear as "Political - preview only" in Activity and do not increment Junk actions requested.</w:t>
+      </w:r>
+    </w:p>
+    <w:p>
+      <w:pPr>
+        <w:pStyle w:val="Heading2"/>
+        <w:keepNext/>
+        <w:spacing w:before="240" w:after="80"/>
+      </w:pPr>
+      <w:r>
+        <w:rPr>
+          <w:b/>
+          <w:sz w:val="26"/>
+          <w:color w:val="000000"/>
+        </w:rPr>
+        <w:t xml:space="preserve">10.2 Store archive and local export</w:t>
+      </w:r>
+    </w:p>
+    <w:p>
+      <w:pPr>
+        <w:spacing w:after="120"/>
+      </w:pPr>
+      <w:r>
+        <w:t xml:space="preserve">The signed archive stage builds with automatic development signing and production identities. The local archive at </w:t>
+      </w:r>
+      <w:r>
+        <w:rPr>
+          <w:rFonts w:ascii="Courier New" w:hAnsi="Courier New" w:cs="Courier New"/>
+          <w:sz w:val="19"/>
+          <w:shd w:val="clear" w:color="auto" w:fill="F2F2F2"/>
+        </w:rPr>
+        <w:t xml:space="preserve">outputs/store/Mail-Filter.xcarchive</w:t>
+      </w:r>
+      <w:r>
+        <w:t xml:space="preserve"> passed archive-stage capability and profile verification. A negative check confirmed that strict distribution validation rejects that development-signed archive.</w:t>
+      </w:r>
+    </w:p>
+    <w:p>
+      <w:pPr>
+        <w:spacing w:after="120"/>
+      </w:pPr>
+      <w:r>
+        <w:t xml:space="preserve">App Store export then succeeded at </w:t>
+      </w:r>
+      <w:r>
+        <w:rPr>
+          <w:rFonts w:ascii="Courier New" w:hAnsi="Courier New" w:cs="Courier New"/>
+          <w:sz w:val="19"/>
+          <w:shd w:val="clear" w:color="auto" w:fill="F2F2F2"/>
+        </w:rPr>
+        <w:t xml:space="preserve">outputs/store/export/Mail-Filter.pkg</w:t>
+      </w:r>
+      <w:r>
+        <w:t xml:space="preserve">. The maintained export verifier checked the Apple-issued App Store installer signature, a matching installer/app team, distribution signatures on the app and embedded extension, explicit unexpired App Store profiles, the provisioned production group, no debugging permission, matching privacy manifests and absence of engineering tools or custom installer scripts. The package was expanded into temporary files for inspection. These build commands did not install or upload it; subsequent upload and submission are recorded in Section 10.4.</w:t>
+      </w:r>
+    </w:p>
+    <w:p>
+      <w:pPr>
+        <w:spacing w:after="120"/>
+      </w:pPr>
+      <w:r>
+        <w:t xml:space="preserve">The initial build-15 metadata audit found a missing </w:t>
+      </w:r>
+      <w:r>
+        <w:rPr>
+          <w:rFonts w:ascii="Courier New" w:hAnsi="Courier New" w:cs="Courier New"/>
+          <w:sz w:val="19"/>
+          <w:shd w:val="clear" w:color="auto" w:fill="F2F2F2"/>
+        </w:rPr>
+        <w:t xml:space="preserve">NSHumanReadableCopyright</w:t>
+      </w:r>
+      <w:r>
+        <w:t xml:space="preserve"> value. The publisher approved "Copyright © 2026 Keith Holt. All rights reserved." Build 16 includes this notice in the host metadata, and the payload verifier now rejects a missing or blank notice. The replacement build-16 archive and local export passed the same capability, profile, signature and payload checks; inspecting the exported app confirmed the approved notice and matching app/extension build numbers. The previous build-15 archive and export are preserved under the ignored </w:t>
+      </w:r>
+      <w:r>
+        <w:rPr>
+          <w:rFonts w:ascii="Courier New" w:hAnsi="Courier New" w:cs="Courier New"/>
+          <w:sz w:val="19"/>
+          <w:shd w:val="clear" w:color="auto" w:fill="F2F2F2"/>
+        </w:rPr>
+        <w:t xml:space="preserve">outputs/store/qualification-build-15/</w:t>
+      </w:r>
+      <w:r>
+        <w:t xml:space="preserve"> directory. Build 16 is a metadata update; the signed incoming-mail runtime observations above remain evidence for Development build 15. See </w:t>
+      </w:r>
+      <w:hyperlink r:id="rId22">
+        <w:r>
+          <w:t xml:space="preserve">Apple's distribution preparation guidance</w:t>
+        </w:r>
+      </w:hyperlink>
+      <w:r>
+        <w:t xml:space="preserve">.</w:t>
+      </w:r>
+    </w:p>
+    <w:p>
+      <w:pPr>
+        <w:pStyle w:val="Heading2"/>
+        <w:keepNext/>
+        <w:spacing w:before="240" w:after="80"/>
+      </w:pPr>
+      <w:r>
+        <w:rPr>
+          <w:b/>
+          <w:sz w:val="26"/>
+          <w:color w:val="000000"/>
+        </w:rPr>
+        <w:t xml:space="preserve">10.3 Remaining qualification</w:t>
+      </w:r>
+    </w:p>
+    <w:p>
+      <w:pPr>
+        <w:spacing w:after="120"/>
+      </w:pPr>
+      <w:r>
+        <w:t xml:space="preserve">Remaining runtime qualification includes signed setup archive import/confirmation, user-selected email-file and support-report panels, permission-denial behavior and clean-install/update recovery. Repeat the relevant checks from a final Store or TestFlight installation. The tests above do not establish App Review acceptance.</w:t>
+      </w:r>
+    </w:p>
+    <w:p>
+      <w:pPr>
+        <w:pStyle w:val="Heading2"/>
+        <w:keepNext/>
+        <w:spacing w:before="240" w:after="80"/>
+      </w:pPr>
+      <w:r>
+        <w:rPr>
+          <w:b/>
+          <w:sz w:val="26"/>
+          <w:color w:val="000000"/>
+        </w:rPr>
+        <w:t xml:space="preserve">10.4 Upload and submission on October 19</w:t>
+      </w:r>
+    </w:p>
+    <w:p>
+      <w:pPr>
+        <w:spacing w:after="120"/>
+      </w:pPr>
+      <w:r>
+        <w:t xml:space="preserve">Transporter rejected build 16 with error 90362 because the extension executable did not match its </w:t>
+      </w:r>
+      <w:r>
+        <w:rPr>
+          <w:rFonts w:ascii="Courier New" w:hAnsi="Courier New" w:cs="Courier New"/>
+          <w:sz w:val="19"/>
+          <w:shd w:val="clear" w:color="auto" w:fill="F2F2F2"/>
+        </w:rPr>
+        <w:t xml:space="preserve">.appex</w:t>
+      </w:r>
+      <w:r>
+        <w:t xml:space="preserve"> basename. Build 17 corrected the executable name in the sandboxed configurations and added validation for this constraint. Build 18 added public Privacy Policy and Support links in Setup &amp; help. The versioned upload package is </w:t>
+      </w:r>
+      <w:r>
+        <w:rPr>
+          <w:rFonts w:ascii="Courier New" w:hAnsi="Courier New" w:cs="Courier New"/>
+          <w:sz w:val="19"/>
+          <w:shd w:val="clear" w:color="auto" w:fill="F2F2F2"/>
+        </w:rPr>
+        <w:t xml:space="preserve">outputs/store/Mail-Filter-2.1.0-build-18.pkg</w:t>
+      </w:r>
+      <w:r>
+        <w:t xml:space="preserve">.</w:t>
+      </w:r>
+    </w:p>
+    <w:p>
+      <w:pPr>
+        <w:spacing w:after="120"/>
+      </w:pPr>
+      <w:r>
+        <w:t xml:space="preserve">The public support and privacy pages are live at </w:t>
+      </w:r>
+      <w:r>
+        <w:rPr>
+          <w:rFonts w:ascii="Courier New" w:hAnsi="Courier New" w:cs="Courier New"/>
+          <w:sz w:val="19"/>
+          <w:shd w:val="clear" w:color="auto" w:fill="F2F2F2"/>
+        </w:rPr>
+        <w:t xml:space="preserve">https://keithholt.github.io/Mail-Filter/support.html</w:t>
+      </w:r>
+      <w:r>
+        <w:t xml:space="preserve"> and </w:t>
+      </w:r>
+      <w:r>
+        <w:rPr>
+          <w:rFonts w:ascii="Courier New" w:hAnsi="Courier New" w:cs="Courier New"/>
+          <w:sz w:val="19"/>
+          <w:shd w:val="clear" w:color="auto" w:fill="F2F2F2"/>
+        </w:rPr>
+        <w:t xml:space="preserve">https://keithholt.github.io/Mail-Filter/privacy.html</w:t>
+      </w:r>
+      <w:r>
+        <w:t xml:space="preserve">. Four screenshots and synthetic reviewer samples were prepared. App Store Connect showed build 18 as Ready to Submit, and version 2.1.0 was saved with build 18 selected and the updated review notes. The publisher then reported completing submission. The selected primary category is Productivity, with Utilities secondary; Content Rights was saved by the publisher. Apple has not yet approved the submission. Automatic release after approval is selected.</w:t>
       </w:r>
     </w:p>
     <w:sectPr>

</xml_diff>